<commit_message>
Align transaction monitoring with port 8083 RuleEngine Swagger UI and update reports
</commit_message>
<xml_diff>
--- a/تقرير_مشروع_الربط_بين_تحصيل_ونظام_AML.docx
+++ b/تقرير_مشروع_الربط_بين_تحصيل_ونظام_AML.docx
@@ -2647,7 +2647,7 @@
                 <w:color w:val="2C3E50"/>
                 <w:sz w:val="18"/>
               </w:rPr>
-              <w:t>محرك القواعد والحركات (RuleEngine)</w:t>
+              <w:t>سواجر محرك مراقبة المعاملات (Swagger UI)</w:t>
             </w:r>
           </w:p>
         </w:tc>
@@ -2679,7 +2679,7 @@
                 <w:color w:val="2C3E50"/>
                 <w:sz w:val="18"/>
               </w:rPr>
-              <w:t>http://10.225.119.170:8083/ruleengine/v1</w:t>
+              <w:t>http://10.225.119.170:8083/ruleengine/v1/swagger-ui/index.html#/</w:t>
             </w:r>
           </w:p>
         </w:tc>
@@ -2711,7 +2711,105 @@
                 <w:color w:val="2C3E50"/>
                 <w:sz w:val="18"/>
               </w:rPr>
-              <w:t>محرك تقييم القواعد ومراقبة المعاملات المالية اللحظية EFRM</w:t>
+              <w:t>توثيق Swagger التفاعلي لمحرك القواعد ومراقبة المعاملات (OpenAPI: /v3/api-docs)</w:t>
+            </w:r>
+          </w:p>
+        </w:tc>
+      </w:tr>
+      <w:tr>
+        <w:tc>
+          <w:tcPr>
+            <w:tcW w:type="dxa" w:w="2880"/>
+            <w:shd w:fill="F8FAFC"/>
+            <w:tcMar>
+              <w:top w:w="90" w:type="dxa"/>
+              <w:bottom w:w="90" w:type="dxa"/>
+              <w:left w:w="130" w:type="dxa"/>
+              <w:right w:w="130" w:type="dxa"/>
+            </w:tcMar>
+            <w:tcBorders>
+              <w:top w:val="single" w:sz="4" w:space="0" w:color="E2E8F0"/>
+              <w:bottom w:val="single" w:sz="4" w:space="0" w:color="E2E8F0"/>
+              <w:left w:val="single" w:sz="4" w:space="0" w:color="E2E8F0"/>
+              <w:right w:val="single" w:sz="4" w:space="0" w:color="E2E8F0"/>
+            </w:tcBorders>
+          </w:tcPr>
+          <w:p>
+            <w:pPr>
+              <w:jc w:val="right"/>
+              <w:bidi/>
+            </w:pPr>
+            <w:r>
+              <w:rPr>
+                <w:rFonts w:ascii="Calibri" w:hAnsi="Calibri"/>
+                <w:color w:val="2C3E50"/>
+                <w:sz w:val="18"/>
+              </w:rPr>
+              <w:t>نقطة تقييم الحركة المالية اللحظية</w:t>
+            </w:r>
+          </w:p>
+        </w:tc>
+        <w:tc>
+          <w:tcPr>
+            <w:tcW w:type="dxa" w:w="3600"/>
+            <w:shd w:fill="F8FAFC"/>
+            <w:tcMar>
+              <w:top w:w="90" w:type="dxa"/>
+              <w:bottom w:w="90" w:type="dxa"/>
+              <w:left w:w="130" w:type="dxa"/>
+              <w:right w:w="130" w:type="dxa"/>
+            </w:tcMar>
+            <w:tcBorders>
+              <w:top w:val="single" w:sz="4" w:space="0" w:color="E2E8F0"/>
+              <w:bottom w:val="single" w:sz="4" w:space="0" w:color="E2E8F0"/>
+              <w:left w:val="single" w:sz="4" w:space="0" w:color="E2E8F0"/>
+              <w:right w:val="single" w:sz="4" w:space="0" w:color="E2E8F0"/>
+            </w:tcBorders>
+          </w:tcPr>
+          <w:p>
+            <w:pPr>
+              <w:jc w:val="right"/>
+              <w:bidi/>
+            </w:pPr>
+            <w:r>
+              <w:rPr>
+                <w:rFonts w:ascii="Calibri" w:hAnsi="Calibri"/>
+                <w:color w:val="2C3E50"/>
+                <w:sz w:val="18"/>
+              </w:rPr>
+              <w:t>POST http://10.225.119.170:8083/ruleengine/v1/transaction/card_txn</w:t>
+            </w:r>
+          </w:p>
+        </w:tc>
+        <w:tc>
+          <w:tcPr>
+            <w:tcW w:type="dxa" w:w="2880"/>
+            <w:shd w:fill="F8FAFC"/>
+            <w:tcMar>
+              <w:top w:w="90" w:type="dxa"/>
+              <w:bottom w:w="90" w:type="dxa"/>
+              <w:left w:w="130" w:type="dxa"/>
+              <w:right w:w="130" w:type="dxa"/>
+            </w:tcMar>
+            <w:tcBorders>
+              <w:top w:val="single" w:sz="4" w:space="0" w:color="E2E8F0"/>
+              <w:bottom w:val="single" w:sz="4" w:space="0" w:color="E2E8F0"/>
+              <w:left w:val="single" w:sz="4" w:space="0" w:color="E2E8F0"/>
+              <w:right w:val="single" w:sz="4" w:space="0" w:color="E2E8F0"/>
+            </w:tcBorders>
+          </w:tcPr>
+          <w:p>
+            <w:pPr>
+              <w:jc w:val="right"/>
+              <w:bidi/>
+            </w:pPr>
+            <w:r>
+              <w:rPr>
+                <w:rFonts w:ascii="Calibri" w:hAnsi="Calibri"/>
+                <w:color w:val="2C3E50"/>
+                <w:sz w:val="18"/>
+              </w:rPr>
+              <w:t>نقطة تقييم حركات البطاقات والشراء اللحظية بنمطي SYNC و ASYNC (حماية X-API-KEY)</w:t>
             </w:r>
           </w:p>
         </w:tc>
@@ -8100,6 +8198,128 @@
     </w:p>
     <w:p>
       <w:pPr>
+        <w:spacing w:before="280" w:after="120"/>
+        <w:jc w:val="right"/>
+        <w:bidi/>
+      </w:pPr>
+      <w:r>
+        <w:rPr>
+          <w:rFonts w:ascii="Calibri" w:hAnsi="Calibri"/>
+          <w:b/>
+          <w:color w:val="0E76A8"/>
+          <w:sz w:val="27"/>
+        </w:rPr>
+        <w:t>نموذج استجابة محرك القواعد المباشر (RuleEngineResponse - Port 8083):</w:t>
+      </w:r>
+    </w:p>
+    <w:p>
+      <w:pPr>
+        <w:spacing w:line="288" w:lineRule="auto" w:after="100"/>
+        <w:jc w:val="right"/>
+        <w:bidi/>
+      </w:pPr>
+      <w:r>
+        <w:rPr>
+          <w:rFonts w:ascii="Calibri" w:hAnsi="Calibri"/>
+          <w:b w:val="0"/>
+          <w:color w:val="2C3E50"/>
+          <w:sz w:val="21"/>
+        </w:rPr>
+        <w:t>يعيد محرك القواعد في المسار POST /ruleengine/v1/transaction/card_txn الاستجابة المعيارية التالية:</w:t>
+      </w:r>
+    </w:p>
+    <w:tbl>
+      <w:tblPr>
+        <w:tblW w:type="auto" w:w="0"/>
+        <w:jc w:val="center"/>
+        <w:tblLook w:firstColumn="1" w:firstRow="1" w:lastColumn="0" w:lastRow="0" w:noHBand="0" w:noVBand="1" w:val="04A0"/>
+        <w:bidiVisual/>
+      </w:tblPr>
+      <w:tblGrid>
+        <w:gridCol w:w="9936"/>
+      </w:tblGrid>
+      <w:tr>
+        <w:tc>
+          <w:tcPr>
+            <w:tcW w:type="dxa" w:w="9360"/>
+            <w:shd w:fill="F1F5F9"/>
+            <w:tcMar>
+              <w:top w:w="100" w:type="dxa"/>
+              <w:bottom w:w="100" w:type="dxa"/>
+              <w:left w:w="150" w:type="dxa"/>
+              <w:right w:w="150" w:type="dxa"/>
+            </w:tcMar>
+            <w:tcBorders>
+              <w:top w:val="single" w:sz="6" w:space="0" w:color="CBD5E1"/>
+              <w:bottom w:val="single" w:sz="6" w:space="0" w:color="CBD5E1"/>
+              <w:left w:val="single" w:sz="6" w:space="0" w:color="CBD5E1"/>
+              <w:right w:val="single" w:sz="6" w:space="0" w:color="CBD5E1"/>
+            </w:tcBorders>
+          </w:tcPr>
+          <w:p>
+            <w:pPr>
+              <w:spacing w:line="252" w:lineRule="auto" w:after="0"/>
+              <w:jc w:val="left"/>
+            </w:pPr>
+            <w:r>
+              <w:rPr>
+                <w:rFonts w:ascii="Consolas" w:hAnsi="Consolas"/>
+                <w:color w:val="1E293B"/>
+                <w:sz w:val="17"/>
+              </w:rPr>
+              <w:t>{</w:t>
+              <w:br/>
+              <w:t xml:space="preserve">  "fact": "card_txn",</w:t>
+              <w:br/>
+              <w:t xml:space="preserve">  "executedRuleCount": 4,</w:t>
+              <w:br/>
+              <w:t xml:space="preserve">  "totalScore": 850,</w:t>
+              <w:br/>
+              <w:t xml:space="preserve">  "highestSeverity": "CRITICAL",</w:t>
+              <w:br/>
+              <w:t xml:space="preserve">  "matchedRuleCount": 1,</w:t>
+              <w:br/>
+              <w:t xml:space="preserve">  "signals": [</w:t>
+              <w:br/>
+              <w:t xml:space="preserve">    {</w:t>
+              <w:br/>
+              <w:t xml:space="preserve">      "ruleCode": "POS_HIGH_VALUE_TXN",</w:t>
+              <w:br/>
+              <w:t xml:space="preserve">      "signalCode": "POS_HIGH_VALUE_TXN",</w:t>
+              <w:br/>
+              <w:t xml:space="preserve">      "signalSeverity": "CRITICAL",</w:t>
+              <w:br/>
+              <w:t xml:space="preserve">      "severityRank": 1,</w:t>
+              <w:br/>
+              <w:t xml:space="preserve">      "signalWeight": 850</w:t>
+              <w:br/>
+              <w:t xml:space="preserve">    }</w:t>
+              <w:br/>
+              <w:t xml:space="preserve">  ],</w:t>
+              <w:br/>
+              <w:t xml:space="preserve">  "decision": "BLOCK",</w:t>
+              <w:br/>
+              <w:t xml:space="preserve">  "policyCode": "POLICY_HIGH_VALUE_THRESHOLD",</w:t>
+              <w:br/>
+              <w:t xml:space="preserve">  "alertGenerated": true,</w:t>
+              <w:br/>
+              <w:t xml:space="preserve">  "executionId": 987654321,</w:t>
+              <w:br/>
+              <w:t xml:space="preserve">  "test": false</w:t>
+              <w:br/>
+              <w:t>}</w:t>
+            </w:r>
+          </w:p>
+        </w:tc>
+      </w:tr>
+    </w:tbl>
+    <w:p>
+      <w:pPr>
+        <w:spacing w:after="100"/>
+      </w:pPr>
+    </w:p>
+    <w:p>
+      <w:pPr>
         <w:spacing w:before="360" w:after="160"/>
         <w:jc w:val="right"/>
         <w:bidi/>

</xml_diff>

<commit_message>
Add turnkey views.py, urls.py, Django settings fallback in kanji_client, and update docs
</commit_message>
<xml_diff>
--- a/تقرير_مشروع_الربط_بين_تحصيل_ونظام_AML.docx
+++ b/تقرير_مشروع_الربط_بين_تحصيل_ونظام_AML.docx
@@ -1977,7 +1977,7 @@
           <w:color w:val="0E76A8"/>
           <w:sz w:val="27"/>
         </w:rPr>
-        <w:t>شجرة الملفات البرمجية للموديول (16 ملفاً برمجياً تم بناؤها واختبارها بنجاح):</w:t>
+        <w:t>شجرة الملفات البرمجية للموديول (18 ملفاً برمجياً تم بناؤها واختبارها بنجاح):</w:t>
       </w:r>
     </w:p>
     <w:tbl>
@@ -2026,6 +2026,10 @@
               <w:t>├── apps.py                     # إعدادات تطبيق جانغو (TahseelAmlConfig)</w:t>
               <w:br/>
               <w:t>├── admin.py                    # لوحة التحكم الرقابية بأقفال الأمان</w:t>
+              <w:br/>
+              <w:t>├── views.py                    # واجهات استقبال الـ Webhooks وفحص الصحة الرقابية</w:t>
+              <w:br/>
+              <w:t>├── urls.py                     # مسارات الربط الشبكي للتطبيق</w:t>
               <w:br/>
               <w:t>├── DEVELOPER_DOCUMENTATION.md  # دليل المطورين الشامل</w:t>
               <w:br/>
@@ -9279,19 +9283,21 @@
               </w:rPr>
               <w:t># إعدادات منظومة مكافحة غسل الأموال (Tahseel AML &amp; EFRM Configuration)</w:t>
               <w:br/>
-              <w:t>AML_BASE_URL = "http://10.225.119.170:8000/screening/v1"</w:t>
+              <w:t>AML_SCREENING_URL = "http://10.225.119.170:8000/screening/v1"</w:t>
+              <w:br/>
+              <w:t>AML_RULEENGINE_URL = "http://10.225.119.170:8083/ruleengine/v1"</w:t>
               <w:br/>
               <w:t>AML_API_KEY = "YOUR_PROVISIONED_API_KEY"</w:t>
               <w:br/>
               <w:t>AML_INSTITUTION_ID = "ULTIMATE_PAY"</w:t>
               <w:br/>
-              <w:t>AML_SOURCE_SYSTEM_ONBOARDING = "TAHSEEL"</w:t>
-              <w:br/>
-              <w:t>AML_SOURCE_SYSTEM_TXN = "PG_SWITCH"</w:t>
+              <w:t>AML_SOURCE_SYSTEM = "TAHSEEL"</w:t>
               <w:br/>
               <w:t>AML_WEBHOOK_URL = "https://tahseeltest.ultimate-pay.net/api/aml/webhook/"</w:t>
               <w:br/>
               <w:t>AML_IS_SANDBOX = False</w:t>
+              <w:br/>
+              <w:t>AML_TIMEOUT = 10</w:t>
             </w:r>
           </w:p>
         </w:tc>

</xml_diff>